<commit_message>
Regenerate docx with combined document and fixed heading colors
- New task_analysis_combined.docx: all 5 reports in one file with TOC
  page and page breaks between sections (synthesis first, then 4 tasks)
- Fixed heading colors: strip Word theme color attributes so dark gray
  RGB (#2B2B2B) renders correctly in Word and Google Docs
- Updated md_to_docx.py: --combined mode, theme stripping, page breaks

https://claude.ai/code/session_011iji7txW5y1z47ZBJhqBU5
</commit_message>
<xml_diff>
--- a/projects/tabular-llms-research/reports/task-analysis/column_type_annotation_report.docx
+++ b/projects/tabular-llms-research/reports/task-analysis/column_type_annotation_report.docx
@@ -4949,7 +4949,7 @@
       <w:b/>
       <w:bCs/>
       <w:color w:val="2B2B2B"/>
-      <w:sz w:val="28"/>
+      <w:sz w:val="44"/>
       <w:szCs w:val="28"/>
     </w:rPr>
   </w:style>
@@ -4973,7 +4973,7 @@
       <w:b/>
       <w:bCs/>
       <w:color w:val="2B2B2B"/>
-      <w:sz w:val="26"/>
+      <w:sz w:val="32"/>
       <w:szCs w:val="26"/>
     </w:rPr>
   </w:style>
@@ -4997,6 +4997,7 @@
       <w:b/>
       <w:bCs/>
       <w:color w:val="2B2B2B"/>
+      <w:sz w:val="26"/>
     </w:rPr>
   </w:style>
   <w:style w:type="paragraph" w:styleId="Heading4">
@@ -5016,12 +5017,13 @@
       <w:outlineLvl w:val="3"/>
     </w:pPr>
     <w:rPr>
-      <w:rFonts w:asciiTheme="majorHAnsi" w:eastAsiaTheme="majorEastAsia" w:hAnsiTheme="majorHAnsi" w:cstheme="majorBidi"/>
+      <w:rFonts w:asciiTheme="majorHAnsi" w:eastAsiaTheme="majorEastAsia" w:hAnsiTheme="majorHAnsi" w:cstheme="majorBidi" w:ascii="Calibri" w:hAnsi="Calibri"/>
       <w:b/>
       <w:bCs/>
       <w:i/>
       <w:iCs/>
-      <w:color w:val="4F81BD" w:themeColor="accent1"/>
+      <w:color w:val="2B2B2B"/>
+      <w:sz w:val="22"/>
     </w:rPr>
   </w:style>
   <w:style w:type="paragraph" w:styleId="Heading5">

</xml_diff>